<commit_message>
auto: XHS cards — 2026-07-14
</commit_message>
<xml_diff>
--- a/docs/xhs/2026-07-14/科技报/发布文案.docx
+++ b/docs/xhs/2026-07-14/科技报/发布文案.docx
@@ -11,7 +11,7 @@
         <w:rPr>
           <w:color w:val="FF3366"/>
         </w:rPr>
-        <w:t>第9条封神！AI圈今天炸了</w:t>
+        <w:t>今天AI圈又地震了…</w:t>
       </w:r>
     </w:p>
     <w:p>
@@ -40,98 +40,77 @@
         <w:spacing w:line="384" w:lineRule="auto"/>
       </w:pPr>
       <w:r>
-        <w:t>兄弟姐妹们，今天的AI快讯真的是一颗接一颗的炸弹，尤其是第9条，看完我直接坐不住了。</w:t>
+        <w:t>刚睡醒刷手机，直接被一条消息炸清醒：苹果起诉OpenAI，指控前员工偷机密文件！这波科技巨头撕逼，比科幻片还刺激。</w:t>
         <w:br/>
         <w:br/>
-        <w:t>先看最炸的：</w:t>
+        <w:t>🚨 苹果起诉OpenAI：前员工利用漏洞窃取机密文件</w:t>
         <w:br/>
-        <w:br/>
-        <w:t>#1 ⭐⭐⭐⭐⭐ 视频生成赛道又出独角兽</w:t>
-        <w:br/>
-        <w:t>PixVerse直接融了4.39亿美元，估值飙到20亿+。视频AI还在烧钱大战，但资本就是敢赌。</w:t>
-        <w:br/>
-        <w:t>💬 锐评：这钱烧得值不值？看谁能先跑通商业模式吧。</w:t>
+        <w:t>苹果指控一名前员工在跳槽OpenAI后，利用罕见bug从苹果网络下载大量机密文件。诉讼里甚至提到，该员工曾开玩笑说“未经授权访问系统”… 科技公司的人才争夺战，已经白热化到这种程度了？</w:t>
         <w:br/>
         <w:t>原文：TechCrunch</w:t>
         <w:br/>
         <w:br/>
-        <w:t>#2 ⭐⭐⭐⭐⭐ 苹果 vs OpenAI：商业机密大战</w:t>
+        <w:t>💬 锐评：硅谷的“商业间谍”戏码，越来越像《黑镜》了。建议苹果赶紧给系统打补丁，不然下一个被偷的可能是Siri的源代码。</w:t>
         <w:br/>
-        <w:t>苹果起诉前员工跳槽OpenAI后窃取机密，还说员工开玩笑黑进系统。</w:t>
         <w:br/>
-        <w:t>💬 锐评：AI人才争夺战已经撕破脸了，以后跳槽得先签保密协议。</w:t>
+        <w:t>🚀 视频生成赛道又爆了：PixVerse融资4.39亿美元，估值超20亿</w:t>
+        <w:br/>
+        <w:t>这家公司靠视频生成AI拿到天价融资，计划扩展世界模型产品。资本对AI视频的热情，简直像当年对元宇宙一样疯狂。</w:t>
         <w:br/>
         <w:t>原文：TechCrunch</w:t>
         <w:br/>
         <w:br/>
-        <w:t>#3 ⭐⭐⭐⭐⭐ 纳德拉警告：AI可能是特洛伊木马</w:t>
-        <w:br/>
-        <w:t>微软CEO说用大型AI实验室的模型可能有风险，这话从微软嘴里说出来有点微妙啊。</w:t>
-        <w:br/>
-        <w:t>💬 锐评：开源 vs 闭源，大佬亲自下场站队了。</w:t>
-        <w:br/>
-        <w:t>原文：TechCrunch</w:t>
+        <w:t>💬 锐评：视频生成卷成这样，以后拍电影是不是只要写个剧本，AI就能直接出片？</w:t>
         <w:br/>
         <w:br/>
-        <w:t>#4 ⭐⭐⭐⭐ Nous Research估值15亿</w:t>
+        <w:t>🍏 苹果发布iOS 27公测版：Siri AI大升级</w:t>
         <w:br/>
-        <w:t>做AI智能体的公司也要起飞了，Hermes智能体团队融了7500万。</w:t>
-        <w:br/>
-        <w:t>💬 锐评：智能体才是AI的未来，资本终于懂了。</w:t>
-        <w:br/>
-        <w:t>原文：TechCrunch</w:t>
-        <w:br/>
-        <w:br/>
-        <w:t>#5 ⭐⭐⭐⭐ Anthropic给印度人降价</w:t>
-        <w:br/>
-        <w:t>Claude在印度搞本地化定价，美国之外最大的市场。</w:t>
-        <w:br/>
-        <w:t>💬 锐评：AI公司开始卷新兴市场了，中国用户啥时候有优惠？</w:t>
-        <w:br/>
-        <w:t>原文：TechCrunch</w:t>
-        <w:br/>
-        <w:br/>
-        <w:t>#6 ⭐⭐⭐⭐ iOS 27公测，Siri AI终于来了</w:t>
-        <w:br/>
-        <w:t>苹果这次没画饼，新版Siri真的能用，而且很简洁。</w:t>
-        <w:br/>
-        <w:t>💬 锐评：苹果终于认真做AI了，但能不能追上ChatGPT？</w:t>
+        <w:t>新版Siri支持更复杂的任务处理，深度集成设备功能。实测说Apple Watch终于像台真正的腕上电脑了。</w:t>
         <w:br/>
         <w:t>原文：The Verge</w:t>
         <w:br/>
         <w:br/>
-        <w:t>#7 ⭐⭐⭐⭐ 腾讯混元Hy3登顶全球周榜</w:t>
+        <w:t>💬 锐评：Siri终于支棱起来了？希望这次别又是“嘿Siri，今天天气怎么样”之后就没下文了。</w:t>
         <w:br/>
-        <w:t>一周处理6万亿Token，国产模型杀疯了。</w:t>
         <w:br/>
-        <w:t>💬 锐评：国产AI已经不只是“能打”，是“能赢”。</w:t>
+        <w:t>🇨🇳 英伟达在中国首秀AIPC：笔记本内集成曼哈顿级算力</w:t>
+        <w:br/>
+        <w:t>英伟达想把AIPC标准攥手里，未来笔记本直接跑AI大模型不是梦。</w:t>
         <w:br/>
         <w:t>原文：爱范儿</w:t>
         <w:br/>
         <w:br/>
-        <w:t>#8 ⭐⭐⭐ Hugging Face + Cerebras搞实时语音AI</w:t>
-        <w:br/>
-        <w:t>把Gemma 4用在低延迟语音场景，硬核合作。</w:t>
-        <w:br/>
-        <w:t>💬 锐评：语音AI要变天了，以后打电话可能都是AI。</w:t>
-        <w:br/>
-        <w:t>原文：Hugging Face Blog</w:t>
+        <w:t>💬 锐评：以后出差不用带工作站了，一台笔记本搞定所有AI任务？英伟达这波操作，是想把英特尔和AMD都卷哭。</w:t>
         <w:br/>
         <w:br/>
-        <w:t>#9 ⭐⭐⭐ 英伟达AIPC中国首秀</w:t>
+        <w:t>🐧 腾讯混元Hy3登顶OpenRouter周榜：单周处理Token超6万亿</w:t>
         <w:br/>
-        <w:t>笔记本里塞进“一座曼哈顿”的AI算力，这概念太炸了。</w:t>
-        <w:br/>
-        <w:t>💬 锐评：以后笔记本就是你的私人AI超级计算机，苹果你慌不慌？</w:t>
+        <w:t>国产大模型终于扬眉吐气，推理效率和用户规模双提升，说明腾讯在AI基础模型上的投入没白费。</w:t>
         <w:br/>
         <w:t>原文：爱范儿</w:t>
         <w:br/>
         <w:br/>
-        <w:t>#10 ⭐⭐⭐ 宇树G1机器人上《自然》</w:t>
+        <w:t>💬 锐评：混元这波给力，国产大模型终于能在国际榜单上刷存在感了。</w:t>
         <w:br/>
-        <w:t>人形机器人完成活体手术，这已经不是实验室玩具了。</w:t>
         <w:br/>
-        <w:t>💬 锐</w:t>
+        <w:t>🤖 宇树G1机器人完成两例活体手术，登上《自然》</w:t>
+        <w:br/>
+        <w:t>人形机器人做手术？这不是科幻，是现实。G1在医疗精密操作上的突破，让具身智能离落地又近了一步。</w:t>
+        <w:br/>
+        <w:t>原文：爱范儿</w:t>
+        <w:br/>
+        <w:br/>
+        <w:t>💬 锐评：以后进手术室，主刀医生可能是个机器人？这画面想想就有点刺激。</w:t>
+        <w:br/>
+        <w:br/>
+        <w:t>🛠️ 腾讯WorkBuddy入门指南：更适合国人体质的Codex</w:t>
+        <w:br/>
+        <w:t>AI编程助手，主打协作而不是替代，帮你拆解任务推进工作。</w:t>
+        <w:br/>
+        <w:t>原文：爱范儿</w:t>
+        <w:br/>
+        <w:br/>
+        <w:t>💬 锐评：国内终于有靠谱的AI</w:t>
       </w:r>
     </w:p>
     <w:p>
@@ -147,7 +126,7 @@
         <w:rPr>
           <w:color w:val="0088FF"/>
         </w:rPr>
-        <w:t>#AI  #人工智能  #AI快讯  #科技前沿  #每日AI  #大模型  #机器人  #苹果</w:t>
+        <w:t>#AI  #人工智能  #AI快讯  #科技前沿  #每日AI  #ChatGPT  #OpenAI  #大模型</w:t>
       </w:r>
     </w:p>
     <w:p>
@@ -183,7 +162,7 @@
         <w:pStyle w:val="ListBullet"/>
       </w:pPr>
       <w:r>
-        <w:t>视频生成AI初创公司PixVerse完成4.39亿美元融资，估值突破20亿美元。该公司计划利用新资金扩展其世界模型产品并拓展全球市场。此轮巨额融资表明投资者对AI视频生成赛道的持续看好，同时也凸显了该领域日益激烈的竞争格局。</w:t>
+        <w:t>视频生成AI初创公司PixVerse完成4.39亿美元融资，估值突破20亿美元。该公司计划利用新资金扩展其世界模型产品并覆盖全球更多地区客户。此轮融资规模巨大，反映出资本对AI视频生成赛道的持续狂热。</w:t>
       </w:r>
     </w:p>
     <w:p>
@@ -204,7 +183,7 @@
         <w:rPr>
           <w:sz w:val="24"/>
         </w:rPr>
-        <w:t>#2 ★★★★★  苹果起诉OpenAI，指控前员工窃取商业机密</w:t>
+        <w:t>#2 ★★★★★  苹果起诉OpenAI：前员工利用漏洞窃取机密文件</w:t>
       </w:r>
     </w:p>
     <w:p>
@@ -221,7 +200,7 @@
         <w:pStyle w:val="ListBullet"/>
       </w:pPr>
       <w:r>
-        <w:t>苹果公司对OpenAI提起诉讼，指控一名前员工在跳槽至OpenAI后，利用罕见漏洞长期下载机密文件。诉讼还包含员工开玩笑谈论未经授权访问苹果系统等惊人指控。此案凸显AI人才争夺战中的知识产权保护问题，可能影响行业竞争规则。</w:t>
+        <w:t>苹果公司起诉OpenAI，指控一名前员工在离职加入OpenAI后，利用罕见漏洞从苹果网络下载大量机密文件。诉讼中包含员工开玩笑称未经授权访问苹果系统等惊人指控，凸显科技巨头间人才与商业秘密争夺的白热化。</w:t>
       </w:r>
     </w:p>
     <w:p>
@@ -242,7 +221,7 @@
         <w:rPr>
           <w:sz w:val="24"/>
         </w:rPr>
-        <w:t>#3 ★★★★★  纳德拉警告：使用AI可能面临“特洛伊木马”风险</w:t>
+        <w:t>#3 ★★★★☆  Anthropic在印度推出Claude本地化定价</w:t>
       </w:r>
     </w:p>
     <w:p>
@@ -259,83 +238,7 @@
         <w:pStyle w:val="ListBullet"/>
       </w:pPr>
       <w:r>
-        <w:t>微软CEO萨提亚·纳德拉发出惊人警告，称使用大型AI实验室的专有模型可能像“特洛伊木马”一样带来风险。这一观点引发硅谷AI社区激烈讨论，反映出业界对依赖封闭模型供应商的深层担忧，以及开源与闭源AI路线之争的升级。</w:t>
-      </w:r>
-    </w:p>
-    <w:p>
-      <w:r>
-        <w:rPr>
-          <w:color w:val="3366CC"/>
-          <w:sz w:val="18"/>
-        </w:rPr>
-        <w:t>https://techcrunch.com/2026/07/13/satya-nadella-has-issued-a-shocking-warning-to-companies-using-ai/</w:t>
-      </w:r>
-    </w:p>
-    <w:p/>
-    <w:p>
-      <w:pPr>
-        <w:pStyle w:val="Heading3"/>
-      </w:pPr>
-      <w:r>
-        <w:rPr>
-          <w:sz w:val="24"/>
-        </w:rPr>
-        <w:t>#4 ★★★★☆  Nous Research洽谈融资，估值达15亿美元</w:t>
-      </w:r>
-    </w:p>
-    <w:p>
-      <w:r>
-        <w:rPr>
-          <w:color w:val="888888"/>
-          <w:sz w:val="18"/>
-        </w:rPr>
-        <w:t>来源: TechCrunch</w:t>
-      </w:r>
-    </w:p>
-    <w:p>
-      <w:pPr>
-        <w:pStyle w:val="ListBullet"/>
-      </w:pPr>
-      <w:r>
-        <w:t>AI智能体开发商Nous Research正进行新一轮融资谈判，估值达15亿美元，计划筹集至少7500万美元。该公司以Hermes智能体闻名，此轮融资由Robot Ventures领投。这标志着AI智能体领域持续获得资本青睐，市场对自主AI系统的期待日益高涨。</w:t>
-      </w:r>
-    </w:p>
-    <w:p>
-      <w:r>
-        <w:rPr>
-          <w:color w:val="3366CC"/>
-          <w:sz w:val="18"/>
-        </w:rPr>
-        <w:t>https://techcrunch.com/2026/07/13/hermes-agent-maker-nous-research-in-talks-for-new-funding-at-1-5b-valuation/</w:t>
-      </w:r>
-    </w:p>
-    <w:p/>
-    <w:p>
-      <w:pPr>
-        <w:pStyle w:val="Heading3"/>
-      </w:pPr>
-      <w:r>
-        <w:rPr>
-          <w:sz w:val="24"/>
-        </w:rPr>
-        <w:t>#5 ★★★★☆  Anthropic为印度市场本地化Claude定价</w:t>
-      </w:r>
-    </w:p>
-    <w:p>
-      <w:r>
-        <w:rPr>
-          <w:color w:val="888888"/>
-          <w:sz w:val="18"/>
-        </w:rPr>
-        <w:t>来源: TechCrunch</w:t>
-      </w:r>
-    </w:p>
-    <w:p>
-      <w:pPr>
-        <w:pStyle w:val="ListBullet"/>
-      </w:pPr>
-      <w:r>
-        <w:t>Anthropic开始为印度用户提供以卢比计价的Claude订阅方案，印度是其美国以外最大市场。此举表明AI公司正在积极拓展新兴市场，通过本地化定价策略降低使用门槛，以在全球AI服务竞争中抢占用户份额。</w:t>
+        <w:t>Anthropic开始为印度用户提供以卢比计价的Claude订阅方案。印度是其美国之外的最大市场，此举旨在通过本地化定价降低用户门槛，扩大Claude在印度市场的渗透率，应对日益激烈的全球AI助手竞争。</w:t>
       </w:r>
     </w:p>
     <w:p>
@@ -356,7 +259,7 @@
         <w:rPr>
           <w:sz w:val="24"/>
         </w:rPr>
-        <w:t>#6 ★★★★☆  苹果发布iOS 27公开测试版，Siri AI正式亮相</w:t>
+        <w:t>#4 ★★★★★  苹果发布iOS 27公测版，Siri AI大升级</w:t>
       </w:r>
     </w:p>
     <w:p>
@@ -373,7 +276,7 @@
         <w:pStyle w:val="ListBullet"/>
       </w:pPr>
       <w:r>
-        <w:t>苹果发布iOS 27及其他主要操作系统更新的公开测试版，最大亮点是延迟已久的Siri AI升级。据测试者反馈，新版Siri确实可用且表现简洁高效。这一更新标志着苹果在AI助手领域迈出关键一步，有望重塑用户与设备的交互方式。</w:t>
+        <w:t>苹果发布iOS 27及watchOS 27等系统公测版，核心亮点是大幅升级的Siri AI。新版Siri支持更复杂的任务处理，并深度集成设备功能。实测表明Siri AI表现可靠，让Apple Watch终于像一台真正的腕上电脑。</w:t>
       </w:r>
     </w:p>
     <w:p>
@@ -394,7 +297,7 @@
         <w:rPr>
           <w:sz w:val="24"/>
         </w:rPr>
-        <w:t>#7 ★★★★☆  腾讯混元Hy3登顶OpenRouter周榜，单周处理Token超6万亿</w:t>
+        <w:t>#5 ★★★★☆  英伟达在中国首秀AIPC，笔记本内集成强大算力</w:t>
       </w:r>
     </w:p>
     <w:p>
@@ -411,7 +314,45 @@
         <w:pStyle w:val="ListBullet"/>
       </w:pPr>
       <w:r>
-        <w:t>腾讯混元大模型Hy3登顶OpenRouter平台周榜，单周处理Token超过6万亿。这一成绩显示国产大模型在推理效率和应用规模上已达到国际领先水平，也反映出中国AI企业在全球大模型服务市场的竞争力正在快速提升。</w:t>
+        <w:t>英伟达在中国首次展示其AIPC产品，将曼哈顿级别的计算能力集成到笔记本中。此举旨在通过定义AIPC标准来抢占未来更大市场份额，标志着PC端AI算力竞争进入新阶段，对移动AI应用生态影响深远。</w:t>
+      </w:r>
+    </w:p>
+    <w:p>
+      <w:r>
+        <w:rPr>
+          <w:color w:val="3366CC"/>
+          <w:sz w:val="18"/>
+        </w:rPr>
+        <w:t>https://www.ifanr.com/1671945</w:t>
+      </w:r>
+    </w:p>
+    <w:p/>
+    <w:p>
+      <w:pPr>
+        <w:pStyle w:val="Heading3"/>
+      </w:pPr>
+      <w:r>
+        <w:rPr>
+          <w:sz w:val="24"/>
+        </w:rPr>
+        <w:t>#6 ★★★★☆  腾讯混元Hy3登顶OpenRouter周榜，单周处理Token超6万亿</w:t>
+      </w:r>
+    </w:p>
+    <w:p>
+      <w:r>
+        <w:rPr>
+          <w:color w:val="888888"/>
+          <w:sz w:val="18"/>
+        </w:rPr>
+        <w:t>来源: 爱范儿</w:t>
+      </w:r>
+    </w:p>
+    <w:p>
+      <w:pPr>
+        <w:pStyle w:val="ListBullet"/>
+      </w:pPr>
+      <w:r>
+        <w:t>腾讯混元大模型Hy3登顶OpenRouter周榜，单周处理Token量超过6万亿。这一成绩展示了国产大模型在推理效率和用户规模上的快速进步，表明腾讯在AI基础模型领域的投入正获得显著市场反馈。</w:t>
       </w:r>
     </w:p>
     <w:p>
@@ -432,7 +373,83 @@
         <w:rPr>
           <w:sz w:val="24"/>
         </w:rPr>
-        <w:t>#8 ★★★☆☆  Hugging Face与Cerebras合作，将Gemma 4用于实时语音AI</w:t>
+        <w:t>#7 ★★★★★  宇树G1机器人完成两例活体手术，登上《自然》</w:t>
+      </w:r>
+    </w:p>
+    <w:p>
+      <w:r>
+        <w:rPr>
+          <w:color w:val="888888"/>
+          <w:sz w:val="18"/>
+        </w:rPr>
+        <w:t>来源: 爱范儿</w:t>
+      </w:r>
+    </w:p>
+    <w:p>
+      <w:pPr>
+        <w:pStyle w:val="ListBullet"/>
+      </w:pPr>
+      <w:r>
+        <w:t>宇树科技的人形机器人G1成功完成两例活体手术，相关成果登上顶级期刊《自然》。这是人形机器人在医疗精密操作领域的重大技术突破，展示了具身智能在现实世界高精度任务中的巨大潜力。</w:t>
+      </w:r>
+    </w:p>
+    <w:p>
+      <w:r>
+        <w:rPr>
+          <w:color w:val="3366CC"/>
+          <w:sz w:val="18"/>
+        </w:rPr>
+        <w:t>https://www.ifanr.com/1671746</w:t>
+      </w:r>
+    </w:p>
+    <w:p/>
+    <w:p>
+      <w:pPr>
+        <w:pStyle w:val="Heading3"/>
+      </w:pPr>
+      <w:r>
+        <w:rPr>
+          <w:sz w:val="24"/>
+        </w:rPr>
+        <w:t>#8 ★★★★☆  腾讯WorkBuddy入门指南：更适合国人体质的Codex</w:t>
+      </w:r>
+    </w:p>
+    <w:p>
+      <w:r>
+        <w:rPr>
+          <w:color w:val="888888"/>
+          <w:sz w:val="18"/>
+        </w:rPr>
+        <w:t>来源: 爱范儿</w:t>
+      </w:r>
+    </w:p>
+    <w:p>
+      <w:pPr>
+        <w:pStyle w:val="ListBullet"/>
+      </w:pPr>
+      <w:r>
+        <w:t>腾讯推出AI编程与工作助手WorkBuddy，被评价为更适合国人体质的Codex。它并非替代用户，而是作为协作搭子，帮助拆解和推进任务。这标志着国产AI工具在提升工作流程智能化方面迈出重要一步。</w:t>
+      </w:r>
+    </w:p>
+    <w:p>
+      <w:r>
+        <w:rPr>
+          <w:color w:val="3366CC"/>
+          <w:sz w:val="18"/>
+        </w:rPr>
+        <w:t>https://www.ifanr.com/1671739</w:t>
+      </w:r>
+    </w:p>
+    <w:p/>
+    <w:p>
+      <w:pPr>
+        <w:pStyle w:val="Heading3"/>
+      </w:pPr>
+      <w:r>
+        <w:rPr>
+          <w:sz w:val="24"/>
+        </w:rPr>
+        <w:t>#9 ★★★★☆  Hugging Face与Cerebras合作，为Gemma 4带来实时语音AI</w:t>
       </w:r>
     </w:p>
     <w:p>
@@ -449,7 +466,7 @@
         <w:pStyle w:val="ListBullet"/>
       </w:pPr>
       <w:r>
-        <w:t>Hugging Face与Cerebras合作，将Google的Gemma 4模型部署于实时语音AI应用。这一合作结合了Cerebras的专用硬件加速与Hugging Face的模型生态，为低延迟语音交互场景提供高性能解决方案，推动AI语音技术向实时化、低成本方向发展。</w:t>
+        <w:t>Hugging Face与芯片公司Cerebras合作，基于Gemma 4模型实现实时语音AI。该合作利用Cerebras的专用硬件加速推理，显著降低语音交互延迟，为构建下一代实时语音助手和对话式AI应用奠定了基础。</w:t>
       </w:r>
     </w:p>
     <w:p>
@@ -470,7 +487,7 @@
         <w:rPr>
           <w:sz w:val="24"/>
         </w:rPr>
-        <w:t>#9 ★★★☆☆  英伟达AIPC中国首秀，笔记本中集成强大AI算力</w:t>
+        <w:t>#10 ★★★★☆  数据智能体：NVIDIA开源数据工作流用于AI Agent</w:t>
       </w:r>
     </w:p>
     <w:p>
@@ -479,7 +496,7 @@
           <w:color w:val="888888"/>
           <w:sz w:val="18"/>
         </w:rPr>
-        <w:t>来源: 爱范儿</w:t>
+        <w:t>来源: Hugging Face - Blog</w:t>
       </w:r>
     </w:p>
     <w:p>
@@ -487,7 +504,7 @@
         <w:pStyle w:val="ListBullet"/>
       </w:pPr>
       <w:r>
-        <w:t>英伟达在中国首次展示其AIPC概念，将相当于“一座曼哈顿”的AI算力集成于笔记本中。此举旨在定义AIPC标准并抢占未来市场份额，标志着AI计算从云端向终端设备迁移的趋势加速，对个人计算产业格局产生深远影响。</w:t>
+        <w:t>NVIDIA在Hugging Face发布开源数据工作流，旨在为AI Agent提供高质量数据。该项目解决了Agent开发中数据获取和处理的痛点，通过标准化流程加速Agent的训练与迭代，对推动Agent生态发展具有重要参考价值。</w:t>
       </w:r>
     </w:p>
     <w:p>
@@ -496,45 +513,7 @@
           <w:color w:val="3366CC"/>
           <w:sz w:val="18"/>
         </w:rPr>
-        <w:t>https://www.ifanr.com/1671945</w:t>
-      </w:r>
-    </w:p>
-    <w:p/>
-    <w:p>
-      <w:pPr>
-        <w:pStyle w:val="Heading3"/>
-      </w:pPr>
-      <w:r>
-        <w:rPr>
-          <w:sz w:val="24"/>
-        </w:rPr>
-        <w:t>#10 ★★★☆☆  宇树G1机器人完成两例活体手术，登上《自然》</w:t>
-      </w:r>
-    </w:p>
-    <w:p>
-      <w:r>
-        <w:rPr>
-          <w:color w:val="888888"/>
-          <w:sz w:val="18"/>
-        </w:rPr>
-        <w:t>来源: 爱范儿</w:t>
-      </w:r>
-    </w:p>
-    <w:p>
-      <w:pPr>
-        <w:pStyle w:val="ListBullet"/>
-      </w:pPr>
-      <w:r>
-        <w:t>宇树科技的G1机器人成功完成两例活体手术，相关成果发表于《自然》杂志。这一突破展示了人形机器人在精密医疗操作中的潜力，标志着具身智能从实验室走向实际临床应用的重要里程碑，对医疗机器人行业具有示范意义。</w:t>
-      </w:r>
-    </w:p>
-    <w:p>
-      <w:r>
-        <w:rPr>
-          <w:color w:val="3366CC"/>
-          <w:sz w:val="18"/>
-        </w:rPr>
-        <w:t>https://www.ifanr.com/1671746</w:t>
+        <w:t>https://huggingface.co/blog/nvidia/open-data-for-agents</w:t>
       </w:r>
     </w:p>
     <w:p/>

</xml_diff>